<commit_message>
Transparent image word wrap start, roadmap updates
</commit_message>
<xml_diff>
--- a/tests/fixtures/cases/case41/input.docx
+++ b/tests/fixtures/cases/case41/input.docx
@@ -179,6 +179,256 @@
     <w:p>
       <w:r>
         <w:t xml:space="preserve">This paragraph should appear below the centered red image since there is not enough horizontal space on either side for text wrapping. Lorem ipsum dolor sit amet, consectetur adipiscing elit. Sed do eiusmod tempor incididunt ut labore et dolore magna aliqua. Ut enim ad minim veniam, quis nostrud exercitation ullamco laboris nisi ut aliquip ex ea commodo consequat. Duis aute irure dolor in reprehenderit in voluptate velit esse cillum dolore eu fugiat nulla pariatur. Excepteur sint occaecat cupidatat non proident, sunt in culpa qui officia deserunt mollit anim id est laborum. </w:t>
+      </w:r>
+    </w:p>
+    <w:p>
+      <w:r>
+        <w:br w:type="page"/>
+      </w:r>
+    </w:p>
+    <w:p>
+      <w:r>
+        <w:t>Page 4: Left-aligned SMALL image (1.5x1 inch). Same structure as page 1 but smaller image to reveal any vertical shift more clearly.</w:t>
+      </w:r>
+    </w:p>
+    <w:p>
+      <w:r>
+        <w:drawing>
+          <wp:anchor distT="91440" distB="91440" distL="0" distR="91440" simplePos="0" relativeHeight="0" behindDoc="0" locked="0" layoutInCell="1" allowOverlap="1">
+            <wp:simplePos x="0" y="0"/>
+            <wp:positionH relativeFrom="column">
+              <wp:align>left</wp:align>
+            </wp:positionH>
+            <wp:positionV relativeFrom="paragraph">
+              <wp:posOffset>0</wp:posOffset>
+            </wp:positionV>
+            <wp:extent cx="1371600" cy="914400"/>
+            <wp:effectExtent l="0" t="0" r="0" b="0"/>
+            <wp:wrapSquare wrapText="bothSides"/>
+            <wp:docPr id="4" name="Picture 4"/>
+            <wp:cNvGraphicFramePr/>
+            <a:graphic>
+              <a:graphicData uri="http://schemas.openxmlformats.org/drawingml/2006/picture">
+                <pic:pic>
+                  <pic:nvPicPr>
+                    <pic:cNvPr id="0" name="green.bmp"/>
+                    <pic:cNvPicPr/>
+                  </pic:nvPicPr>
+                  <pic:blipFill>
+                    <a:blip r:embed="rId10"/>
+                    <a:stretch>
+                      <a:fillRect/>
+                    </a:stretch>
+                  </pic:blipFill>
+                  <pic:spPr>
+                    <a:xfrm>
+                      <a:off x="0" y="0"/>
+                      <a:ext cx="1371600" cy="914400"/>
+                    </a:xfrm>
+                    <a:prstGeom prst="rect"/>
+                  </pic:spPr>
+                </pic:pic>
+              </a:graphicData>
+            </a:graphic>
+          </wp:anchor>
+        </w:drawing>
+      </w:r>
+    </w:p>
+    <w:p>
+      <w:r>
+        <w:t>This text wraps beside the small left-aligned image. Lorem ipsum dolor sit amet, consectetur adipiscing elit. Sed do eiusmod tempor incididunt ut labore et dolore magna aliqua. Ut enim ad minim veniam, quis nostrud exercitation ullamco laboris nisi ut aliquip ex ea commodo consequat. Duis aute irure dolor in reprehenderit in voluptate velit esse cillum dolore eu fugiat nulla pariatur. Excepteur sint occaecat cupidatat non proident, sunt in culpa qui officia deserunt mollit anim id est laborum. The text should flow back to full width below the image.</w:t>
+      </w:r>
+    </w:p>
+    <w:p>
+      <w:r>
+        <w:t>Full-width text below the small image.</w:t>
+      </w:r>
+    </w:p>
+    <w:p>
+      <w:r>
+        <w:br w:type="page"/>
+      </w:r>
+    </w:p>
+    <w:p>
+      <w:r>
+        <w:t>Page 5: Right-aligned image same size as page 1 (2.5x2.5 inch). Compare with page 2 which uses a shorter image.</w:t>
+      </w:r>
+    </w:p>
+    <w:p>
+      <w:r>
+        <w:drawing>
+          <wp:anchor distT="91440" distB="91440" distL="91440" distR="0" simplePos="0" relativeHeight="0" behindDoc="0" locked="0" layoutInCell="1" allowOverlap="1">
+            <wp:simplePos x="0" y="0"/>
+            <wp:positionH relativeFrom="column">
+              <wp:align>right</wp:align>
+            </wp:positionH>
+            <wp:positionV relativeFrom="paragraph">
+              <wp:posOffset>0</wp:posOffset>
+            </wp:positionV>
+            <wp:extent cx="2286000" cy="2286000"/>
+            <wp:effectExtent l="0" t="0" r="0" b="0"/>
+            <wp:wrapSquare wrapText="bothSides"/>
+            <wp:docPr id="5" name="Picture 5"/>
+            <wp:cNvGraphicFramePr/>
+            <a:graphic>
+              <a:graphicData uri="http://schemas.openxmlformats.org/drawingml/2006/picture">
+                <pic:pic>
+                  <pic:nvPicPr>
+                    <pic:cNvPr id="0" name="blue.bmp"/>
+                    <pic:cNvPicPr/>
+                  </pic:nvPicPr>
+                  <pic:blipFill>
+                    <a:blip r:embed="rId9"/>
+                    <a:stretch>
+                      <a:fillRect/>
+                    </a:stretch>
+                  </pic:blipFill>
+                  <pic:spPr>
+                    <a:xfrm>
+                      <a:off x="0" y="0"/>
+                      <a:ext cx="2286000" cy="2286000"/>
+                    </a:xfrm>
+                    <a:prstGeom prst="rect"/>
+                  </pic:spPr>
+                </pic:pic>
+              </a:graphicData>
+            </a:graphic>
+          </wp:anchor>
+        </w:drawing>
+      </w:r>
+    </w:p>
+    <w:p>
+      <w:r>
+        <w:t>This text wraps to the left of the tall right-aligned image. Lorem ipsum dolor sit amet, consectetur adipiscing elit. Sed do eiusmod tempor incididunt ut labore et dolore magna aliqua. Ut enim ad minim veniam, quis nostrud exercitation ullamco laboris nisi ut aliquip ex ea commodo consequat. Duis aute irure dolor in reprehenderit in voluptate velit esse cillum dolore eu fugiat nulla pariatur. Excepteur sint occaecat cupidatat non proident, sunt in culpa qui officia deserunt mollit anim id est laborum. Compare the image vertical position with page 2.</w:t>
+      </w:r>
+    </w:p>
+    <w:p>
+      <w:r>
+        <w:t>Full-width text below the tall right-aligned image.</w:t>
+      </w:r>
+    </w:p>
+    <w:p>
+      <w:r>
+        <w:br w:type="page"/>
+      </w:r>
+    </w:p>
+    <w:p>
+      <w:r>
+        <w:t>Page 6: Image is in the SAME paragraph as text, not in its own paragraph. This is the control case.</w:t>
+      </w:r>
+    </w:p>
+    <w:p>
+      <w:r>
+        <w:t xml:space="preserve">Text before image in same paragraph. </w:t>
+      </w:r>
+      <w:r>
+        <w:drawing>
+          <wp:anchor distT="91440" distB="91440" distL="0" distR="91440" simplePos="0" relativeHeight="0" behindDoc="0" locked="0" layoutInCell="1" allowOverlap="1">
+            <wp:simplePos x="0" y="0"/>
+            <wp:positionH relativeFrom="column">
+              <wp:align>left</wp:align>
+            </wp:positionH>
+            <wp:positionV relativeFrom="paragraph">
+              <wp:posOffset>0</wp:posOffset>
+            </wp:positionV>
+            <wp:extent cx="2286000" cy="1828800"/>
+            <wp:effectExtent l="0" t="0" r="0" b="0"/>
+            <wp:wrapSquare wrapText="bothSides"/>
+            <wp:docPr id="6" name="Picture 6"/>
+            <wp:cNvGraphicFramePr/>
+            <a:graphic>
+              <a:graphicData uri="http://schemas.openxmlformats.org/drawingml/2006/picture">
+                <pic:pic>
+                  <pic:nvPicPr>
+                    <pic:cNvPr id="0" name="green.bmp"/>
+                    <pic:cNvPicPr/>
+                  </pic:nvPicPr>
+                  <pic:blipFill>
+                    <a:blip r:embed="rId10"/>
+                    <a:stretch>
+                      <a:fillRect/>
+                    </a:stretch>
+                  </pic:blipFill>
+                  <pic:spPr>
+                    <a:xfrm>
+                      <a:off x="0" y="0"/>
+                      <a:ext cx="2286000" cy="1828800"/>
+                    </a:xfrm>
+                    <a:prstGeom prst="rect"/>
+                  </pic:spPr>
+                </pic:pic>
+              </a:graphicData>
+            </a:graphic>
+          </wp:anchor>
+        </w:drawing>
+      </w:r>
+    </w:p>
+    <w:p>
+      <w:r>
+        <w:t xml:space="preserve">This text wraps beside the image that shares a paragraph with text. Lorem ipsum dolor sit amet, consectetur adipiscing elit. Sed do eiusmod tempor incididunt ut labore et dolore magna aliqua. Ut enim ad minim veniam, quis nostrud exercitation ullamco laboris nisi ut aliquip ex ea commodo consequat. Duis aute irure dolor in reprehenderit in voluptate velit esse cillum dolore eu fugiat nulla pariatur. Excepteur sint occaecat cupidatat non proident, sunt in culpa qui officia deserunt mollit anim id est laborum. </w:t>
+      </w:r>
+    </w:p>
+    <w:p>
+      <w:r>
+        <w:t>Full-width text after the shared-paragraph image.</w:t>
+      </w:r>
+    </w:p>
+    <w:p>
+      <w:r>
+        <w:br w:type="page"/>
+      </w:r>
+    </w:p>
+    <w:p>
+      <w:r>
+        <w:drawing>
+          <wp:anchor distT="91440" distB="91440" distL="0" distR="91440" simplePos="0" relativeHeight="0" behindDoc="0" locked="0" layoutInCell="1" allowOverlap="1">
+            <wp:simplePos x="0" y="0"/>
+            <wp:positionH relativeFrom="column">
+              <wp:align>left</wp:align>
+            </wp:positionH>
+            <wp:positionV relativeFrom="paragraph">
+              <wp:posOffset>0</wp:posOffset>
+            </wp:positionV>
+            <wp:extent cx="2286000" cy="2286000"/>
+            <wp:effectExtent l="0" t="0" r="0" b="0"/>
+            <wp:wrapSquare wrapText="bothSides"/>
+            <wp:docPr id="7" name="Picture 7"/>
+            <wp:cNvGraphicFramePr/>
+            <a:graphic>
+              <a:graphicData uri="http://schemas.openxmlformats.org/drawingml/2006/picture">
+                <pic:pic>
+                  <pic:nvPicPr>
+                    <pic:cNvPr id="0" name="blue.bmp"/>
+                    <pic:cNvPicPr/>
+                  </pic:nvPicPr>
+                  <pic:blipFill>
+                    <a:blip r:embed="rId9"/>
+                    <a:stretch>
+                      <a:fillRect/>
+                    </a:stretch>
+                  </pic:blipFill>
+                  <pic:spPr>
+                    <a:xfrm>
+                      <a:off x="0" y="0"/>
+                      <a:ext cx="2286000" cy="2286000"/>
+                    </a:xfrm>
+                    <a:prstGeom prst="rect"/>
+                  </pic:spPr>
+                </pic:pic>
+              </a:graphicData>
+            </a:graphic>
+          </wp:anchor>
+        </w:drawing>
+      </w:r>
+    </w:p>
+    <w:p>
+      <w:r>
+        <w:t>Page 7: The left-aligned image is at the top of this page with no preceding text paragraph. Lorem ipsum dolor sit amet, consectetur adipiscing elit. Sed do eiusmod tempor incididunt ut labore et dolore magna aliqua. Ut enim ad minim veniam, quis nostrud exercitation ullamco laboris nisi ut aliquip ex ea commodo consequat. Duis aute irure dolor in reprehenderit in voluptate velit esse cillum dolore eu fugiat nulla pariatur. Excepteur sint occaecat cupidatat non proident, sunt in culpa qui officia deserunt mollit anim id est laborum. This tests whether the image position depends on a preceding paragraph.</w:t>
+      </w:r>
+    </w:p>
+    <w:p>
+      <w:r>
+        <w:t>Full-width text below the top-of-page image.</w:t>
       </w:r>
     </w:p>
     <w:sectPr>

</xml_diff>